<commit_message>
update 初版 & fix error
</commit_message>
<xml_diff>
--- a/DOC_專題文件/初審/初版.docx
+++ b/DOC_專題文件/初審/初版.docx
@@ -670,7 +670,6 @@
     </w:p>
     <w:p>
       <w:pPr>
-        <w:ind w:left="360"/>
         <w:rPr>
           <w:b/>
           <w:bCs/>
@@ -716,9 +715,6 @@
       </w:r>
     </w:p>
     <w:p>
-      <w:pPr>
-        <w:ind w:left="360"/>
-      </w:pPr>
       <w:r>
         <w:rPr>
           <w:b/>
@@ -957,12 +953,196 @@
       </w:r>
     </w:p>
     <w:p>
-      <w:pPr>
-        <w:rPr>
-          <w:rFonts w:hint="eastAsia"/>
-        </w:rPr>
-      </w:pPr>
+      <w:r>
+        <w:rPr>
+          <w:rFonts w:hint="eastAsia"/>
+          <w:b/>
+          <w:bCs/>
+        </w:rPr>
+        <w:t>第</w:t>
+      </w:r>
+      <w:r>
+        <w:rPr>
+          <w:b/>
+          <w:bCs/>
+        </w:rPr>
+        <w:t>4</w:t>
+      </w:r>
+      <w:r>
+        <w:rPr>
+          <w:rFonts w:hint="eastAsia"/>
+          <w:b/>
+          <w:bCs/>
+        </w:rPr>
+        <w:t>章</w:t>
+      </w:r>
+      <w:r>
+        <w:rPr>
+          <w:b/>
+          <w:bCs/>
+        </w:rPr>
+        <w:t xml:space="preserve"> </w:t>
+      </w:r>
+      <w:r>
+        <w:rPr>
+          <w:rFonts w:hint="eastAsia"/>
+          <w:b/>
+          <w:bCs/>
+        </w:rPr>
+        <w:t>專案時程與組織分工</w:t>
+      </w:r>
     </w:p>
+    <w:p>
+      <w:r>
+        <w:rPr>
+          <w:b/>
+          <w:bCs/>
+        </w:rPr>
+        <w:t xml:space="preserve">4-1 </w:t>
+      </w:r>
+      <w:r>
+        <w:rPr>
+          <w:rFonts w:hint="eastAsia"/>
+          <w:b/>
+          <w:bCs/>
+        </w:rPr>
+        <w:t>專案時程</w:t>
+      </w:r>
+      <w:r>
+        <w:t xml:space="preserve"> </w:t>
+      </w:r>
+      <w:r>
+        <w:rPr>
+          <w:rFonts w:hint="eastAsia"/>
+        </w:rPr>
+        <w:t>專案為期一年（二學期）之規劃與控管，分為需求訪談、硬體採購、系統分析、核心程式開發與效能測試等階段，將以甘特圖詳列進度。</w:t>
+      </w:r>
+      <w:r>
+        <w:t xml:space="preserve"> </w:t>
+      </w:r>
+      <w:r>
+        <w:rPr>
+          <w:b/>
+          <w:bCs/>
+        </w:rPr>
+        <w:t xml:space="preserve">4-2 </w:t>
+      </w:r>
+      <w:r>
+        <w:rPr>
+          <w:rFonts w:hint="eastAsia"/>
+          <w:b/>
+          <w:bCs/>
+        </w:rPr>
+        <w:t>專案組織與分工</w:t>
+      </w:r>
+      <w:r>
+        <w:t xml:space="preserve"> </w:t>
+      </w:r>
+      <w:r>
+        <w:rPr>
+          <w:rFonts w:hint="eastAsia"/>
+        </w:rPr>
+        <w:t>依據系統手冊範本建立表格，詳細記載硬體組裝、後端開發、文件撰寫等項目。每一項將指派</w:t>
+      </w:r>
+      <w:r>
+        <w:t xml:space="preserve"> 1 </w:t>
+      </w:r>
+      <w:r>
+        <w:rPr>
+          <w:rFonts w:hint="eastAsia"/>
+        </w:rPr>
+        <w:t>位主要負責人，次要負責人最多</w:t>
+      </w:r>
+      <w:r>
+        <w:t xml:space="preserve"> 2 </w:t>
+      </w:r>
+      <w:r>
+        <w:rPr>
+          <w:rFonts w:hint="eastAsia"/>
+        </w:rPr>
+        <w:t>位。</w:t>
+      </w:r>
+      <w:r>
+        <w:t xml:space="preserve"> </w:t>
+      </w:r>
+      <w:r>
+        <w:rPr>
+          <w:b/>
+          <w:bCs/>
+        </w:rPr>
+        <w:t xml:space="preserve">4-3 </w:t>
+      </w:r>
+      <w:r>
+        <w:rPr>
+          <w:rFonts w:hint="eastAsia"/>
+          <w:b/>
+          <w:bCs/>
+        </w:rPr>
+        <w:t>上傳</w:t>
+      </w:r>
+      <w:r>
+        <w:rPr>
+          <w:b/>
+          <w:bCs/>
+        </w:rPr>
+        <w:t>GitHub</w:t>
+      </w:r>
+      <w:r>
+        <w:rPr>
+          <w:rFonts w:hint="eastAsia"/>
+          <w:b/>
+          <w:bCs/>
+        </w:rPr>
+        <w:t>紀錄</w:t>
+      </w:r>
+      <w:r>
+        <w:t xml:space="preserve"> </w:t>
+      </w:r>
+      <w:r>
+        <w:rPr>
+          <w:rFonts w:hint="eastAsia"/>
+        </w:rPr>
+        <w:t>此節將放置團隊成員上傳</w:t>
+      </w:r>
+      <w:r>
+        <w:t xml:space="preserve"> GitHub </w:t>
+      </w:r>
+      <w:r>
+        <w:rPr>
+          <w:rFonts w:hint="eastAsia"/>
+        </w:rPr>
+        <w:t>的</w:t>
+      </w:r>
+      <w:proofErr w:type="gramStart"/>
+      <w:r>
+        <w:rPr>
+          <w:rFonts w:hint="eastAsia"/>
+        </w:rPr>
+        <w:t>紀錄截圖</w:t>
+      </w:r>
+      <w:proofErr w:type="gramEnd"/>
+      <w:r>
+        <w:rPr>
+          <w:rFonts w:hint="eastAsia"/>
+        </w:rPr>
+        <w:t>，並依規定在圖標題明確標</w:t>
+      </w:r>
+      <w:proofErr w:type="gramStart"/>
+      <w:r>
+        <w:rPr>
+          <w:rFonts w:hint="eastAsia"/>
+        </w:rPr>
+        <w:t>註</w:t>
+      </w:r>
+      <w:proofErr w:type="gramEnd"/>
+      <w:r>
+        <w:rPr>
+          <w:rFonts w:hint="eastAsia"/>
+        </w:rPr>
+        <w:t>每位同學的中文姓名及學號。</w:t>
+      </w:r>
+    </w:p>
+    <w:p/>
     <w:sectPr>
       <w:pgSz w:w="11906" w:h="16838"/>
       <w:pgMar w:top="1440" w:right="1800" w:bottom="1440" w:left="1800" w:header="851" w:footer="992" w:gutter="0"/>
@@ -1287,15 +1467,6 @@
   </w:num>
   <w:num w:numId="5" w16cid:durableId="1467969797">
     <w:abstractNumId w:val="1"/>
-    <w:lvlOverride w:ilvl="0"/>
-    <w:lvlOverride w:ilvl="1"/>
-    <w:lvlOverride w:ilvl="2"/>
-    <w:lvlOverride w:ilvl="3"/>
-    <w:lvlOverride w:ilvl="4"/>
-    <w:lvlOverride w:ilvl="5"/>
-    <w:lvlOverride w:ilvl="6"/>
-    <w:lvlOverride w:ilvl="7"/>
-    <w:lvlOverride w:ilvl="8"/>
   </w:num>
 </w:numbering>
 </file>
@@ -1905,6 +2076,7 @@
   <w:style w:type="character" w:default="1" w:styleId="a0">
     <w:name w:val="Default Paragraph Font"/>
     <w:uiPriority w:val="1"/>
+    <w:semiHidden/>
     <w:unhideWhenUsed/>
   </w:style>
   <w:style w:type="table" w:default="1" w:styleId="a1">

</xml_diff>